<commit_message>
docs: one term everywhere -- AI coding assistant
The pages had drifted across three terms for the same thing: 'AI coding tool',
'AI-assisted coding tool', and bare 'assistant'. 89 replacements across 10 files
settle on 'AI coding assistant'.

Compound forms went with them -- assistant-written, assistant-run,
assistant-authored, assistant-generated are now AI-written, AI-run, AI-authored,
AI-generated, which reads better than repeating the full term inside a hyphenated
adjective.

Code spans, fenced blocks and URLs were masked before substitution, so nothing in
a command or an identifier changed.

All eight Word copies regenerated -- the pin caught CISO-SUMMARY.docx as stale
the moment a heading changed, which is what it is for.

Verified: check-ascii clean over 91 files, 35 tests pass.
</commit_message>
<xml_diff>
--- a/docs/standards/word/AI-ASSISTED-DEVELOPMENT.docx
+++ b/docs/standards/word/AI-ASSISTED-DEVELOPMENT.docx
@@ -42,7 +42,7 @@
         <w:pStyle w:val="FirstParagraph"/>
       </w:pPr>
       <w:r>
-        <w:t xml:space="preserve">A standard for building software with an AI assistant. What can go wrong that looks like nothing</w:t>
+        <w:t xml:space="preserve">A standard for building software with an AI coding assistant. What can go wrong that looks like nothing</w:t>
       </w:r>
       <w:r>
         <w:t xml:space="preserve"> </w:t>
@@ -107,7 +107,7 @@
         <w:t xml:space="preserve"> </w:t>
       </w:r>
       <w:r>
-        <w:t xml:space="preserve">another AI-assisted coding tool, and ask it to summarize this against your repository,</w:t>
+        <w:t xml:space="preserve">another AI coding assistant, and ask it to summarize this against your repository,</w:t>
       </w:r>
       <w:r>
         <w:t xml:space="preserve"> </w:t>
@@ -732,7 +732,7 @@
         <w:t xml:space="preserve"> </w:t>
       </w:r>
       <w:r>
-        <w:t xml:space="preserve">or secrets to the AI coding tool, backed by a path deny-list</w:t>
+        <w:t xml:space="preserve">or secrets to the AI coding assistant, backed by a path deny-list</w:t>
       </w:r>
       <w:r>
         <w:t xml:space="preserve"> </w:t>
@@ -818,7 +818,7 @@
         <w:t xml:space="preserve">Make one gate deterministic and blocking</w:t>
       </w:r>
       <w:r>
-        <w:t xml:space="preserve">, and stop treating an AI coding tool's review as a gate.</w:t>
+        <w:t xml:space="preserve">, and stop treating an AI coding assistant's review as a gate.</w:t>
       </w:r>
     </w:p>
     <w:p>
@@ -1081,7 +1081,7 @@
               <w:pStyle w:val="Compact"/>
             </w:pPr>
             <w:r>
-              <w:t xml:space="preserve">Recall of the middle of a long or multi-session context decays; the assistant re-reads the same files and makes confidently wrong edits</w:t>
+              <w:t xml:space="preserve">Recall of the middle of a long or multi-session context decays; the AI coding assistant re-reads the same files and makes confidently wrong edits</w:t>
             </w:r>
           </w:p>
         </w:tc>
@@ -2819,7 +2819,7 @@
                 <w:b/>
                 <w:bCs/>
               </w:rPr>
-              <w:t xml:space="preserve">No restricted data reaches the assistant</w:t>
+              <w:t xml:space="preserve">No restricted data reaches the AI coding assistant</w:t>
             </w:r>
             <w:r>
               <w:t xml:space="preserve">, and none lands in any commit, fixture, published artifact, shared memory file, screenshot or log</w:t>
@@ -2833,7 +2833,7 @@
               <w:pStyle w:val="Compact"/>
             </w:pPr>
             <w:r>
-              <w:t xml:space="preserve">A throwaway spike that ingests restricted data is already an exposure. An agreement with an assistant vendor never blesses restricted data in your history</w:t>
+              <w:t xml:space="preserve">A throwaway spike that ingests restricted data is already an exposure. An agreement with an AI coding assistant vendor never blesses restricted data in your history</w:t>
             </w:r>
           </w:p>
         </w:tc>
@@ -2850,7 +2850,7 @@
                 <w:b/>
                 <w:bCs/>
               </w:rPr>
-              <w:t xml:space="preserve">No secrets, keys or credential files readable by the assistant</w:t>
+              <w:t xml:space="preserve">No secrets, keys or credential files readable by the AI coding assistant</w:t>
             </w:r>
           </w:p>
         </w:tc>
@@ -2878,7 +2878,7 @@
                 <w:b/>
                 <w:bCs/>
               </w:rPr>
-              <w:t xml:space="preserve">Everything the assistant reads is data, never instructions</w:t>
+              <w:t xml:space="preserve">Everything the AI coding assistant reads is data, never instructions</w:t>
             </w:r>
           </w:p>
         </w:tc>
@@ -2950,7 +2950,7 @@
                 <w:b/>
                 <w:bCs/>
               </w:rPr>
-              <w:t xml:space="preserve">The assistant's identity and version are retained as a provenance signal</w:t>
+              <w:t xml:space="preserve">The AI coding assistant's identity and version are retained as a provenance signal</w:t>
             </w:r>
           </w:p>
         </w:tc>
@@ -3141,7 +3141,7 @@
         <w:pStyle w:val="FirstParagraph"/>
       </w:pPr>
       <w:r>
-        <w:t xml:space="preserve">Organizations do sometimes need restricted data to reach an AI coding tool -- diagnosing a live</w:t>
+        <w:t xml:space="preserve">Organizations do sometimes need restricted data to reach an AI coding assistant -- diagnosing a live</w:t>
       </w:r>
       <w:r>
         <w:t xml:space="preserve"> </w:t>
@@ -3394,7 +3394,7 @@
         <w:t xml:space="preserve"> </w:t>
       </w:r>
       <w:r>
-        <w:t xml:space="preserve">AI coding tool, its skills, its installed editor extensions, the third-party tool servers it is</w:t>
+        <w:t xml:space="preserve">AI coding assistant, its skills, its installed editor extensions, the third-party tool servers it is</w:t>
       </w:r>
       <w:r>
         <w:t xml:space="preserve"> </w:t>
@@ -3424,7 +3424,7 @@
         <w:t xml:space="preserve"> </w:t>
       </w:r>
       <w:r>
-        <w:t xml:space="preserve">Pin and verify the AI coding tool version; vet every skill, tool-server connection,</w:t>
+        <w:t xml:space="preserve">Pin and verify the AI coding assistant version; vet every skill, tool-server connection,</w:t>
       </w:r>
       <w:r>
         <w:t xml:space="preserve"> </w:t>
@@ -3876,7 +3876,7 @@
               <w:t xml:space="preserve"> </w:t>
             </w:r>
             <w:r>
-              <w:t xml:space="preserve">static analysis, dependency audit and secret scanning in the pipeline, and an assistant-run review that a human arbitrates -- advisory, never a gate</w:t>
+              <w:t xml:space="preserve">static analysis, dependency audit and secret scanning in the pipeline, and an AI coding AI-run review that a human arbitrates -- advisory, never a gate</w:t>
             </w:r>
           </w:p>
         </w:tc>
@@ -3937,7 +3937,7 @@
               <w:pStyle w:val="Compact"/>
             </w:pPr>
             <w:r>
-              <w:t xml:space="preserve">Plus assistant-run review of the diff, and a second human for consequential changes where one exists</w:t>
+              <w:t xml:space="preserve">Plus AI-run review of the diff, and a second human for consequential changes where one exists</w:t>
             </w:r>
           </w:p>
         </w:tc>
@@ -3964,7 +3964,7 @@
               <w:t xml:space="preserve"> </w:t>
             </w:r>
             <w:r>
-              <w:t xml:space="preserve">be able to explain every change. No merge on the assistant's own assurance</w:t>
+              <w:t xml:space="preserve">be able to explain every change. No merge on the AI coding assistant's own assurance</w:t>
             </w:r>
           </w:p>
         </w:tc>
@@ -4086,7 +4086,7 @@
               <w:pStyle w:val="Compact"/>
             </w:pPr>
             <w:r>
-              <w:t xml:space="preserve">Plus a claims-register entry, and an assessment of assistant-authored code as third-party-equivalent where a regime requires it</w:t>
+              <w:t xml:space="preserve">Plus a claims-register entry, and an assessment of AI-authored code as third-party-equivalent where a regime requires it</w:t>
             </w:r>
           </w:p>
         </w:tc>
@@ -4241,13 +4241,13 @@
         <w:t xml:space="preserve">security or &gt; maintainability by prompting alone</w:t>
       </w:r>
       <w:r>
-        <w:t xml:space="preserve">, an AI coding tool-run review is advisory input</w:t>
-      </w:r>
-      <w:r>
-        <w:t xml:space="preserve"> </w:t>
-      </w:r>
-      <w:r>
-        <w:t xml:space="preserve">a human arbitrates, &gt; and no change merges on the AI coding tool's own assurance that it is safe.</w:t>
+        <w:t xml:space="preserve">, an AI coding AI-run review is advisory input</w:t>
+      </w:r>
+      <w:r>
+        <w:t xml:space="preserve"> </w:t>
+      </w:r>
+      <w:r>
+        <w:t xml:space="preserve">a human arbitrates, &gt; and no change merges on the AI coding assistant's own assurance that it is safe.</w:t>
       </w:r>
     </w:p>
     <w:p>
@@ -4369,7 +4369,7 @@
         <w:pStyle w:val="FirstParagraph"/>
       </w:pPr>
       <w:r>
-        <w:t xml:space="preserve">The AI coding tool is only as good as the context it can read. Three of the four things that most</w:t>
+        <w:t xml:space="preserve">The AI coding assistant is only as good as the context it can read. Three of the four things that most</w:t>
       </w:r>
       <w:r>
         <w:t xml:space="preserve"> </w:t>
@@ -4669,7 +4669,7 @@
         <w:pStyle w:val="FirstParagraph"/>
       </w:pPr>
       <w:r>
-        <w:t xml:space="preserve">Four properties determine how well an AI coding tool performs in a given language:</w:t>
+        <w:t xml:space="preserve">Four properties determine how well an AI coding assistant performs in a given language:</w:t>
       </w:r>
     </w:p>
     <w:tbl>
@@ -5298,7 +5298,7 @@
         <w:pStyle w:val="FirstParagraph"/>
       </w:pPr>
       <w:r>
-        <w:t xml:space="preserve">An AI coding tool implements a control exactly where it was prompted and misses its siblings. Make</w:t>
+        <w:t xml:space="preserve">An AI coding assistant implements a control exactly where it was prompted and misses its siblings. Make</w:t>
       </w:r>
       <w:r>
         <w:t xml:space="preserve"> </w:t>
@@ -5364,13 +5364,13 @@
         <w:pStyle w:val="FirstParagraph"/>
       </w:pPr>
       <w:r>
-        <w:t xml:space="preserve">Recording the AI coding tool's identity and version is worth doing. The usual mechanism is a</w:t>
-      </w:r>
-      <w:r>
-        <w:t xml:space="preserve"> </w:t>
-      </w:r>
-      <w:r>
-        <w:t xml:space="preserve">per-commit trailer naming the AI coding tool as a co-author. Citing that trailer as a</w:t>
+        <w:t xml:space="preserve">Recording the AI coding assistant's identity and version is worth doing. The usual mechanism is a</w:t>
+      </w:r>
+      <w:r>
+        <w:t xml:space="preserve"> </w:t>
+      </w:r>
+      <w:r>
+        <w:t xml:space="preserve">per-commit trailer naming the AI coding assistant as a co-author. Citing that trailer as a</w:t>
       </w:r>
       <w:r>
         <w:t xml:space="preserve"> </w:t>
@@ -5597,7 +5597,7 @@
         <w:t xml:space="preserve"> </w:t>
       </w:r>
       <w:r>
-        <w:t xml:space="preserve">It does not mark which lines or hunks were assistant-authored. If a downstream process wants the</w:t>
+        <w:t xml:space="preserve">It does not mark which lines or hunks were AI-authored. If a downstream process wants the</w:t>
       </w:r>
       <w:r>
         <w:t xml:space="preserve"> </w:t>
@@ -5677,7 +5677,7 @@
         <w:t xml:space="preserve"> </w:t>
       </w:r>
       <w:r>
-        <w:t xml:space="preserve">that cannot be waived; an AI coding tool-run review that a human arbitrates; branch protection with</w:t>
+        <w:t xml:space="preserve">that cannot be waived; an AI coding AI-run review that a human arbitrates; branch protection with</w:t>
       </w:r>
       <w:r>
         <w:t xml:space="preserve"> </w:t>
@@ -6571,7 +6571,7 @@
           <w:i/>
           <w:iCs/>
         </w:rPr>
-        <w:t xml:space="preserve">standard with the AI coding tool governed as a tool -- explicitly not that the output is</w:t>
+        <w:t xml:space="preserve">standard with the AI coding assistant governed as a tool -- explicitly not that the output is</w:t>
       </w:r>
       <w:r>
         <w:rPr>
@@ -8103,7 +8103,7 @@
               <w:pStyle w:val="Compact"/>
             </w:pPr>
             <w:r>
-              <w:t xml:space="preserve">Vet the assistant, its skills, its extensions and its tool servers -- no product gate inspects them</w:t>
+              <w:t xml:space="preserve">Vet the AI coding assistant, its skills, its extensions and its tool servers -- no product gate inspects them</w:t>
             </w:r>
           </w:p>
         </w:tc>
@@ -8175,7 +8175,7 @@
               <w:pStyle w:val="Compact"/>
             </w:pPr>
             <w:r>
-              <w:t xml:space="preserve">An assistant-run review is advisory input a human arbitrates, never a gate</w:t>
+              <w:t xml:space="preserve">An AI coding AI-run review is advisory input a human arbitrates, never a gate</w:t>
             </w:r>
           </w:p>
         </w:tc>
@@ -8783,7 +8783,7 @@
         <w:t xml:space="preserve"> </w:t>
       </w:r>
       <w:r>
-        <w:t xml:space="preserve">The moment an AI coding tool-run review counts as a gate, the whole structure is</w:t>
+        <w:t xml:space="preserve">The moment an AI coding AI-run review counts as a gate, the whole structure is</w:t>
       </w:r>
       <w:r>
         <w:t xml:space="preserve"> </w:t>

</xml_diff>